<commit_message>
Docs + GTM refresh to GA-4-complete state; VALIDATED_RELEASE for v0.9.1-pilot-rc2
- README: 117 tests; new 'Validated evidence' section (live happy path, IaC gateway ENFORCE, fail-closed proofs, 8 live findings fixed)
- VALIDATED_RELEASE.md: rc2 release block + GA-4 clean-account validation table
- PRODUCTION-PLAN: A8 formal release DONE
- GTM: customer + leadership deck proof slides rebuilt on captured evidence; regulatory doc evidence rows updated; Depth-Evidence points to production validation evidence; decks/docx regenerated from generators
</commit_message>
<xml_diff>
--- a/docs/Housing-AgentCore-Regulatory-Adherence.docx
+++ b/docs/Housing-AgentCore-Regulatory-Adherence.docx
@@ -2261,7 +2261,7 @@
                 <w:sz w:val="19"/>
                 <w:szCs w:val="19"/>
               </w:rPr>
-              <w:t xml:space="preserve">Reproducible, manifest-driven infrastructure-as-code and a 30-check governance test harness that runs in enforcement mode.</w:t>
+              <w:t xml:space="preserve">Reproducible AWS CDK infrastructure-as-code, a 117-test automated suite gating every change in CI, and captured clean-account validation runs (the full governed workflow live end-to-end; the Cedar authorization gateway deployed as code in enforcement mode) committed in the repo's evidence/ folder.</w:t>
             </w:r>
           </w:p>
         </w:tc>
@@ -2850,7 +2850,7 @@
                 <w:sz w:val="19"/>
                 <w:szCs w:val="19"/>
               </w:rPr>
-              <w:t xml:space="preserve">Reproducible IaC + the 30-check governance harness</w:t>
+              <w:t xml:space="preserve">Reproducible CDK IaC + the automated test suite + captured validation evidence</w:t>
             </w:r>
           </w:p>
         </w:tc>

</xml_diff>